<commit_message>
docs: preserve reference file and document backend port 8001
</commit_message>
<xml_diff>
--- a/docs/management/exports/CampusLoop_Closeout_Task_Packages.docx
+++ b/docs/management/exports/CampusLoop_Closeout_Task_Packages.docx
@@ -8,7 +8,7 @@
         <w:widowControl/>
       </w:pPr>
       <w:r>
-        <w:t>CampusLoop 四组收尾任务包（原任务分配修订版）</w:t>
+        <w:t>CampusLoop 四组收尾任务包（参考文件细化版）</w:t>
       </w:r>
     </w:p>
     <w:p>
@@ -223,14 +223,14 @@
         <w:t>http://localhost:5173</w:t>
       </w:r>
       <w:r>
-        <w:t xml:space="preserve">；后端地址为 </w:t>
+        <w:t xml:space="preserve">；后端本地地址调整为 </w:t>
       </w:r>
       <w:r>
         <w:rPr>
           <w:rFonts w:ascii="Consolas" w:hAnsi="Consolas"/>
           <w:sz w:val="20"/>
         </w:rPr>
-        <w:t>http://localhost:8000</w:t>
+        <w:t>http://localhost:8001</w:t>
       </w:r>
       <w:r>
         <w:t xml:space="preserve">；后端接口文档通常为 </w:t>
@@ -240,10 +240,10 @@
           <w:rFonts w:ascii="Consolas" w:hAnsi="Consolas"/>
           <w:sz w:val="20"/>
         </w:rPr>
-        <w:t>http://localhost:8000/docs</w:t>
+        <w:t>http://localhost:8001/docs</w:t>
       </w:r>
       <w:r>
-        <w:t>，以交付版本实际配置为准。MinIO 的默认 S3 地址为 9000，控制台为 9001。</w:t>
+        <w:t>，以交付版本实际配置为准。Compose 容器内监听 8000，本地映射到 8001；MinIO 的默认 S3 地址为 9000，控制台为 9001。</w:t>
       </w:r>
     </w:p>
     <w:p>

</xml_diff>